<commit_message>
Update README and both user guides
</commit_message>
<xml_diff>
--- a/WC2026-Dashboard-Guide-EN.docx
+++ b/WC2026-Dashboard-Guide-EN.docx
@@ -303,6 +303,41 @@
     </w:p>
     <w:p>
       <w:pPr>
+        <w:spacing w:after="100" w:before="0"/>
+      </w:pPr>
+      <w:r>
+        <w:rPr>
+          <w:rFonts w:ascii="Arial" w:cs="Arial" w:eastAsia="Arial" w:hAnsi="Arial"/>
+          <w:b/>
+          <w:bCs/>
+          <w:color w:val="0D1B3E"/>
+          <w:sz w:val="32"/>
+          <w:szCs w:val="32"/>
+        </w:rPr>
+        <w:t>🕐 Timezone</w:t>
+      </w:r>
+    </w:p>
+    <w:p>
+      <w:pPr>
+        <w:spacing w:after="100" w:before="0"/>
+      </w:pPr>
+      <w:r>
+        <w:rPr>
+          <w:rFonts w:ascii="Arial" w:cs="Arial" w:eastAsia="Arial" w:hAnsi="Arial"/>
+          <w:color w:val="1A1A2E"/>
+          <w:sz w:val="22"/>
+          <w:szCs w:val="22"/>
+        </w:rPr>
+        <w:t xml:space="preserve">In the top-right corner of the header, use the 🕐 Time zone: dropdown to select your local timezone. All confirmed kickoff times convert instantly. Times listed as “TBD” are unaffected. The page auto-detects your browser’s timezone on the first visit, and your selection is saved between visits.</w:t>
+      </w:r>
+    </w:p>
+    <w:p>
+      <w:pPr>
+        <w:spacing w:after="0" w:before="200"/>
+      </w:pPr>
+    </w:p>
+    <w:p>
+      <w:pPr>
         <w:pStyle w:val="Heading1"/>
         <w:pBdr>
           <w:bottom w:val="single" w:color="C49010" w:sz="8" w:space="6"/>
@@ -458,7 +493,7 @@
           <w:sz w:val="22"/>
           <w:szCs w:val="22"/>
         </w:rPr>
-        <w:t xml:space="preserve">Center of card — shows the kickoff time (Pacific Daylight Time) before the match, or the final score once it is entered.</w:t>
+        <w:t xml:space="preserve">Center of card — shows the kickoff time in your selected timezone before the match, or the final score once it is entered.</w:t>
       </w:r>
     </w:p>
     <w:p>
@@ -2711,7 +2746,7 @@
           <w:sz w:val="22"/>
           <w:szCs w:val="22"/>
         </w:rPr>
-        <w:t xml:space="preserve">All kickoff times are shown in Pacific Daylight Time (PDT).</w:t>
+        <w:t xml:space="preserve">Kickoff times are shown in your selected timezone. Use the 🕐 Time zone: dropdown in the header to change it at any time — the page defaults to your browser’s local timezone on first visit.</w:t>
       </w:r>
     </w:p>
     <w:p>

</xml_diff>